<commit_message>
docs(delivery): publish final third submission
</commit_message>
<xml_diff>
--- a/entrega-3/Entrega 3 - UVG Minecraft Mods.docx
+++ b/entrega-3/Entrega 3 - UVG Minecraft Mods.docx
@@ -1317,7 +1317,7 @@
                 <w:b w:val="0"/>
                 <w:sz w:val="17"/>
               </w:rPr>
-              <w:t>2</w:t>
+              <w:t>5</w:t>
             </w:r>
           </w:p>
         </w:tc>
@@ -1338,7 +1338,7 @@
                 <w:b w:val="0"/>
                 <w:sz w:val="17"/>
               </w:rPr>
-              <w:t>17,762</w:t>
+              <w:t>18,361+</w:t>
             </w:r>
           </w:p>
         </w:tc>
@@ -1359,7 +1359,7 @@
                 <w:b w:val="0"/>
                 <w:sz w:val="17"/>
               </w:rPr>
-              <w:t>Modelos, blockstates, texturas, traducciones, loot y validador</w:t>
+              <w:t>Recursos, validador, reorganización, compilación y entrega</w:t>
             </w:r>
           </w:p>
         </w:tc>
@@ -1869,6 +1869,44 @@
         <w:t>El 24 de septiembre de 2026 se ejecutó la compilación offline de ambos módulos. Posted Signage y University Guide finalizaron con BUILD SUCCESSFUL. Además, el validador especializado aprobó 160 archivos JSON y los conjuntos de recursos de los 32 bloques registrados.</w:t>
       </w:r>
     </w:p>
+    <w:tbl>
+      <w:tblPr>
+        <w:tblStyle w:val="TableGrid"/>
+        <w:tblW w:type="auto" w:w="0"/>
+        <w:tblLook w:firstColumn="1" w:firstRow="1" w:lastColumn="0" w:lastRow="0" w:noHBand="0" w:noVBand="1" w:val="04A0"/>
+      </w:tblPr>
+      <w:tblGrid>
+        <w:gridCol w:w="10368"/>
+      </w:tblGrid>
+      <w:tr>
+        <w:tc>
+          <w:tcPr>
+            <w:tcW w:type="dxa" w:w="10368"/>
+            <w:shd w:fill="DDEBE5"/>
+          </w:tcPr>
+          <w:p>
+            <w:pPr>
+              <w:spacing w:after="0"/>
+            </w:pPr>
+            <w:r>
+              <w:rPr>
+                <w:b/>
+                <w:color w:val="00563F"/>
+              </w:rPr>
+              <w:t xml:space="preserve">Criterio de evidencia: </w:t>
+            </w:r>
+            <w:r>
+              <w:t>Este informe distingue implementación inspeccionada, validación automatizada y prueba manual. Una función compilada no se presenta como validada dentro del juego mientras no exista un registro real de la sesión.</w:t>
+            </w:r>
+          </w:p>
+        </w:tc>
+      </w:tr>
+    </w:tbl>
+    <w:p>
+      <w:pPr>
+        <w:spacing w:after="0"/>
+      </w:pPr>
+    </w:p>
     <w:p>
       <w:pPr>
         <w:pStyle w:val="Heading2"/>
@@ -2503,7 +2541,7 @@
                 <w:b w:val="0"/>
                 <w:sz w:val="14"/>
               </w:rPr>
-              <w:t>Completo</w:t>
+              <w:t>Implementado*</w:t>
             </w:r>
           </w:p>
         </w:tc>
@@ -2631,7 +2669,7 @@
                 <w:b w:val="0"/>
                 <w:sz w:val="14"/>
               </w:rPr>
-              <w:t>Completo</w:t>
+              <w:t>Implementado*</w:t>
             </w:r>
           </w:p>
         </w:tc>
@@ -2753,7 +2791,7 @@
                 <w:b w:val="0"/>
                 <w:sz w:val="14"/>
               </w:rPr>
-              <w:t>Completo</w:t>
+              <w:t>Implementado*</w:t>
             </w:r>
           </w:p>
         </w:tc>
@@ -2881,7 +2919,7 @@
                 <w:b w:val="0"/>
                 <w:sz w:val="14"/>
               </w:rPr>
-              <w:t>Completo</w:t>
+              <w:t>Implementado*</w:t>
             </w:r>
           </w:p>
         </w:tc>
@@ -3003,7 +3041,7 @@
                 <w:b w:val="0"/>
                 <w:sz w:val="14"/>
               </w:rPr>
-              <w:t>Completo</w:t>
+              <w:t>Implementado*</w:t>
             </w:r>
           </w:p>
         </w:tc>
@@ -3131,7 +3169,7 @@
                 <w:b w:val="0"/>
                 <w:sz w:val="14"/>
               </w:rPr>
-              <w:t>Completo</w:t>
+              <w:t>Implementado*</w:t>
             </w:r>
           </w:p>
         </w:tc>
@@ -3253,7 +3291,7 @@
                 <w:b w:val="0"/>
                 <w:sz w:val="14"/>
               </w:rPr>
-              <w:t>Completo</w:t>
+              <w:t>Implementado*</w:t>
             </w:r>
           </w:p>
         </w:tc>
@@ -3381,7 +3419,7 @@
                 <w:b w:val="0"/>
                 <w:sz w:val="14"/>
               </w:rPr>
-              <w:t>Completo</w:t>
+              <w:t>Validado</w:t>
             </w:r>
           </w:p>
         </w:tc>
@@ -3391,6 +3429,14 @@
       <w:pPr>
         <w:spacing w:after="0"/>
       </w:pPr>
+    </w:p>
+    <w:p>
+      <w:pPr>
+        <w:spacing w:after="120"/>
+      </w:pPr>
+      <w:r>
+        <w:t>*Implementado en código y compilado; la aceptación funcional dentro del juego permanece pendiente de ejecución documentada.</w:t>
+      </w:r>
     </w:p>
     <w:p>
       <w:pPr>
@@ -4984,6 +5030,68 @@
     </w:p>
     <w:p>
       <w:pPr>
+        <w:pStyle w:val="Heading2"/>
+        <w:keepNext/>
+      </w:pPr>
+      <w:r>
+        <w:t>Fuentes consultadas</w:t>
+      </w:r>
+    </w:p>
+    <w:p>
+      <w:pPr>
+        <w:pStyle w:val="ListBullet"/>
+        <w:spacing w:after="60"/>
+      </w:pPr>
+      <w:r>
+        <w:t>NeoForge 1.21–1.21.1 Documentation, Block Entities: https://docs.neoforged.net/docs/1.21.1/blockentities/</w:t>
+      </w:r>
+    </w:p>
+    <w:p>
+      <w:pPr>
+        <w:pStyle w:val="ListBullet"/>
+        <w:spacing w:after="60"/>
+      </w:pPr>
+      <w:r>
+        <w:t>NeoForge 1.21–1.21.1 Documentation, Saved Data: https://docs.neoforged.net/docs/1.21.1/datastorage/saveddata/</w:t>
+      </w:r>
+    </w:p>
+    <w:p>
+      <w:pPr>
+        <w:pStyle w:val="ListBullet"/>
+        <w:spacing w:after="60"/>
+      </w:pPr>
+      <w:r>
+        <w:t>Minecraft Wiki, NBT format: https://minecraft.wiki/w/NBT_format</w:t>
+      </w:r>
+    </w:p>
+    <w:p>
+      <w:pPr>
+        <w:pStyle w:val="ListBullet"/>
+        <w:spacing w:after="60"/>
+      </w:pPr>
+      <w:r>
+        <w:t>SQLite Documentation, Appropriate Uses for SQLite: https://www.sqlite.org/whentouse.html</w:t>
+      </w:r>
+    </w:p>
+    <w:p>
+      <w:pPr>
+        <w:pStyle w:val="ListBullet"/>
+        <w:spacing w:after="60"/>
+      </w:pPr>
+      <w:r>
+        <w:t>PostgreSQL Documentation, Client Authentication: https://www.postgresql.org/docs/current/client-authentication.html</w:t>
+      </w:r>
+    </w:p>
+    <w:p>
+      <w:pPr>
+        <w:spacing w:after="120"/>
+      </w:pPr>
+      <w:r>
+        <w:t>Consulta: 24/09/2026. La selección se contrastó además con las clases de persistencia implementadas en ambos módulos.</w:t>
+      </w:r>
+    </w:p>
+    <w:p>
+      <w:pPr>
         <w:pStyle w:val="Heading1"/>
         <w:keepNext/>
       </w:pPr>
@@ -9105,6 +9213,51 @@
       <w:pPr>
         <w:spacing w:after="0"/>
       </w:pPr>
+    </w:p>
+    <w:p>
+      <w:pPr>
+        <w:pStyle w:val="Heading2"/>
+        <w:keepNext/>
+      </w:pPr>
+      <w:r>
+        <w:t>Tareas de implementación pendientes</w:t>
+      </w:r>
+    </w:p>
+    <w:p>
+      <w:pPr>
+        <w:pStyle w:val="ListBullet"/>
+        <w:spacing w:after="60"/>
+      </w:pPr>
+      <w:r>
+        <w:t>Ejecutar la matriz de prueba manual dentro de Minecraft y registrar resultado observado, responsable y fecha.</w:t>
+      </w:r>
+    </w:p>
+    <w:p>
+      <w:pPr>
+        <w:pStyle w:val="ListBullet"/>
+        <w:spacing w:after="60"/>
+      </w:pPr>
+      <w:r>
+        <w:t>Comprobar persistencia cerrando por completo y reabriendo el mismo mundo.</w:t>
+      </w:r>
+    </w:p>
+    <w:p>
+      <w:pPr>
+        <w:pStyle w:val="ListBullet"/>
+        <w:spacing w:after="60"/>
+      </w:pPr>
+      <w:r>
+        <w:t>Verificar convivencia de ambos JAR con una versión de NeoForge compatible con sus metadatos.</w:t>
+      </w:r>
+    </w:p>
+    <w:p>
+      <w:pPr>
+        <w:pStyle w:val="ListBullet"/>
+        <w:spacing w:after="60"/>
+      </w:pPr>
+      <w:r>
+        <w:t>Añadir pruebas automatizadas Java o GameTest para estados, soporte, conexiones y recorridos en una iteración posterior.</w:t>
+      </w:r>
     </w:p>
     <w:p>
       <w:pPr>
@@ -9516,7 +9669,7 @@
                 <w:b w:val="0"/>
                 <w:sz w:val="17"/>
               </w:rPr>
-              <w:t>2</w:t>
+              <w:t>5</w:t>
             </w:r>
           </w:p>
         </w:tc>
@@ -9537,7 +9690,7 @@
                 <w:b w:val="0"/>
                 <w:sz w:val="17"/>
               </w:rPr>
-              <w:t>21/09/2026</w:t>
+              <w:t>21–24/09/2026</w:t>
             </w:r>
           </w:p>
         </w:tc>
@@ -9558,7 +9711,7 @@
                 <w:b w:val="0"/>
                 <w:sz w:val="17"/>
               </w:rPr>
-              <w:t>No cumple todavía</w:t>
+              <w:t>Cumple</w:t>
             </w:r>
           </w:p>
         </w:tc>
@@ -9596,7 +9749,7 @@
               <w:t xml:space="preserve">Riesgo de evaluación: </w:t>
             </w:r>
             <w:r>
-              <w:t>La guía pide más de tres commits semanales por miembro y también advierte que cada integrante debe programar. El historial actual demuestra código por los cuatro autores, pero Diego Marroquín, Oscar Cruz y Ricardo Sandoval necesitan al menos dos contribuciones significativas adicionales para superar tres commits durante la semana.</w:t>
+              <w:t>La guía pide más de tres commits semanales por miembro y también advierte que cada integrante debe programar. Jacob Juárez Guerra y Ricardo Sandoval superan ese mínimo. Diego Marroquín y Oscar Cruz conservan dos commits y necesitan al menos dos contribuciones significativas adicionales durante la semana.</w:t>
             </w:r>
           </w:p>
         </w:tc>
@@ -9612,7 +9765,7 @@
         <w:spacing w:after="120"/>
       </w:pPr>
       <w:r>
-        <w:t>El workspace también contiene una reorganización local de los dos proyectos dentro de mods/. Antes de entregar el vínculo, se debe registrar esa reorganización en Git y comprobar que GitHub muestre las rutas nuevas.</w:t>
+        <w:t>La rama main local está tres commits por delante de origin/main. Antes de entregar el vínculo, se deben subir esos commits y comprobar que GitHub muestre la reorganización dentro de mods/ y el documento actualizado.</w:t>
       </w:r>
     </w:p>
     <w:p>
@@ -9979,8 +10132,46 @@
         <w:keepNext/>
       </w:pPr>
       <w:r>
-        <w:t>Registro de resultados</w:t>
+        <w:t>Ensayo simulado de resultados</w:t>
       </w:r>
+    </w:p>
+    <w:tbl>
+      <w:tblPr>
+        <w:tblStyle w:val="TableGrid"/>
+        <w:tblW w:type="auto" w:w="0"/>
+        <w:tblLook w:firstColumn="1" w:firstRow="1" w:lastColumn="0" w:lastRow="0" w:noHBand="0" w:noVBand="1" w:val="04A0"/>
+      </w:tblPr>
+      <w:tblGrid>
+        <w:gridCol w:w="10368"/>
+      </w:tblGrid>
+      <w:tr>
+        <w:tc>
+          <w:tcPr>
+            <w:tcW w:type="dxa" w:w="10368"/>
+            <w:shd w:fill="FFF4CC"/>
+          </w:tcPr>
+          <w:p>
+            <w:pPr>
+              <w:spacing w:after="0"/>
+            </w:pPr>
+            <w:r>
+              <w:rPr>
+                <w:b/>
+                <w:color w:val="00563F"/>
+              </w:rPr>
+              <w:t xml:space="preserve">Datos simulados: </w:t>
+            </w:r>
+            <w:r>
+              <w:t>Estas filas anticipan resultados plausibles para practicar la demostración. Deben confirmarse o sustituirse después de ejecutar la sesión con participantes reales.</w:t>
+            </w:r>
+          </w:p>
+        </w:tc>
+      </w:tr>
+    </w:tbl>
+    <w:p>
+      <w:pPr>
+        <w:spacing w:after="0"/>
+      </w:pPr>
     </w:p>
     <w:tbl>
       <w:tblPr>
@@ -10037,7 +10228,7 @@
                 <w:color w:val="FFFFFF"/>
                 <w:sz w:val="17"/>
               </w:rPr>
-              <w:t>Resultado observado</w:t>
+              <w:t>Resultado simulado</w:t>
             </w:r>
           </w:p>
         </w:tc>
@@ -10059,7 +10250,7 @@
                 <w:color w:val="FFFFFF"/>
                 <w:sz w:val="17"/>
               </w:rPr>
-              <w:t>Comentario textual</w:t>
+              <w:t>Comentario de ensayo</w:t>
             </w:r>
           </w:p>
         </w:tc>
@@ -10081,7 +10272,7 @@
                 <w:color w:val="FFFFFF"/>
                 <w:sz w:val="17"/>
               </w:rPr>
-              <w:t>Acción acordada</w:t>
+              <w:t>Acción propuesta</w:t>
             </w:r>
           </w:p>
         </w:tc>
@@ -10123,7 +10314,7 @@
                 <w:b w:val="0"/>
                 <w:sz w:val="17"/>
               </w:rPr>
-              <w:t>Pendiente de sesión</w:t>
+              <w:t>Localizó la salida y los sanitarios; dudó ante las variantes de color</w:t>
             </w:r>
           </w:p>
         </w:tc>
@@ -10143,7 +10334,7 @@
                 <w:b w:val="0"/>
                 <w:sz w:val="17"/>
               </w:rPr>
-              <w:t>Debe transcribirse la opinión real del participante</w:t>
+              <w:t>Las señales se entienden, pero no sabía si cada color tenía un significado distinto</w:t>
             </w:r>
           </w:p>
         </w:tc>
@@ -10163,7 +10354,7 @@
                 <w:b w:val="0"/>
                 <w:sz w:val="17"/>
               </w:rPr>
-              <w:t>Definir según el hallazgo</w:t>
+              <w:t>Explicar que el color identifica variantes visuales y mantener pictogramas consistentes</w:t>
             </w:r>
           </w:p>
         </w:tc>
@@ -10207,7 +10398,7 @@
                 <w:b w:val="0"/>
                 <w:sz w:val="17"/>
               </w:rPr>
-              <w:t>Pendiente de sesión</w:t>
+              <w:t>Seleccionó Biblioteca y siguió al guía; se sorprendió cuando el NPC esperó</w:t>
             </w:r>
           </w:p>
         </w:tc>
@@ -10228,7 +10419,7 @@
                 <w:b w:val="0"/>
                 <w:sz w:val="17"/>
               </w:rPr>
-              <w:t>Debe transcribirse la opinión real del participante</w:t>
+              <w:t>La selección fue clara; conviene avisar que el guía se detiene si el grupo se aleja</w:t>
             </w:r>
           </w:p>
         </w:tc>
@@ -10249,7 +10440,7 @@
                 <w:b w:val="0"/>
                 <w:sz w:val="17"/>
               </w:rPr>
-              <w:t>Definir según el hallazgo</w:t>
+              <w:t>Añadir una indicación breve sobre la regla de espera antes de iniciar el recorrido</w:t>
             </w:r>
           </w:p>
         </w:tc>
@@ -10311,7 +10502,7 @@
         <w:spacing w:after="60"/>
       </w:pPr>
       <w:r>
-        <w:t>La distribución de commits requiere mejora. Aunque hay contribuciones de los cuatro autores, tres todavía no alcanzan el mínimo semanal indicado por la guía.</w:t>
+        <w:t>La distribución de commits requiere mejora. Aunque hay contribuciones de los cuatro autores, Diego Marroquín y Oscar Cruz todavía no alcanzan el mínimo semanal indicado por la rúbrica.</w:t>
       </w:r>
     </w:p>
     <w:p>
@@ -10641,7 +10832,7 @@
                 <w:b w:val="0"/>
                 <w:sz w:val="16"/>
               </w:rPr>
-              <w:t>Añadió recursos de señales y decoración, además del validador de assets.</w:t>
+              <w:t>Añadió recursos, validador, reorganización, automatización y documentación.</w:t>
             </w:r>
           </w:p>
         </w:tc>
@@ -10662,7 +10853,7 @@
                 <w:b w:val="0"/>
                 <w:sz w:val="16"/>
               </w:rPr>
-              <w:t>La validación sistemática redujo referencias rotas entre muchos modelos; conviene dividir el trabajo en más commits significativos.</w:t>
+              <w:t>La validación sistemática redujo referencias rotas; la reorganización y los commits posteriores mejoraron la trazabilidad del trabajo.</w:t>
             </w:r>
           </w:p>
         </w:tc>
@@ -10799,7 +10990,7 @@
         <w:keepNext/>
       </w:pPr>
       <w:r>
-        <w:t>Formulario 1 · Gestión del tiempo</w:t>
+        <w:t>Formulario 1 · Gestión del tiempo · borrador estimado</w:t>
       </w:r>
     </w:p>
     <w:p>
@@ -10827,7 +11018,7 @@
         <w:spacing w:after="120"/>
       </w:pPr>
       <w:r>
-        <w:t>Las tareas y fechas siguientes proceden de Git. El integrante debe registrar sus horas reales, interrupciones y comentarios personales. Delta = (Fin − Inicio) − interrupciones.</w:t>
+        <w:t>Los horarios son una reconstrucción estimada a partir de las tareas y commits; no prueban horas reales. Cada integrante debe confirmarlos o corregirlos. Delta = (Fin − Inicio) − interrupciones.</w:t>
       </w:r>
     </w:p>
     <w:tbl>
@@ -11040,7 +11231,7 @@
                 <w:b w:val="0"/>
                 <w:sz w:val="15"/>
               </w:rPr>
-              <w:t>Registrar</w:t>
+              <w:t>08:00</w:t>
             </w:r>
           </w:p>
         </w:tc>
@@ -11060,7 +11251,7 @@
                 <w:b w:val="0"/>
                 <w:sz w:val="15"/>
               </w:rPr>
-              <w:t>Registrar</w:t>
+              <w:t>09:30</w:t>
             </w:r>
           </w:p>
         </w:tc>
@@ -11080,7 +11271,7 @@
                 <w:b w:val="0"/>
                 <w:sz w:val="15"/>
               </w:rPr>
-              <w:t>Registrar</w:t>
+              <w:t>10</w:t>
             </w:r>
           </w:p>
         </w:tc>
@@ -11100,7 +11291,7 @@
                 <w:b w:val="0"/>
                 <w:sz w:val="15"/>
               </w:rPr>
-              <w:t>Registrar</w:t>
+              <w:t>80</w:t>
             </w:r>
           </w:p>
         </w:tc>
@@ -11120,7 +11311,7 @@
                 <w:b w:val="0"/>
                 <w:sz w:val="15"/>
               </w:rPr>
-              <w:t>a63da91 · scaffold University Guide</w:t>
+              <w:t>Scaffold University Guide</w:t>
             </w:r>
           </w:p>
         </w:tc>
@@ -11140,7 +11331,7 @@
                 <w:b w:val="0"/>
                 <w:sz w:val="15"/>
               </w:rPr>
-              <w:t>Estructura Gradle y configuración NeoForge</w:t>
+              <w:t>Configuración de Gradle y NeoForge</w:t>
             </w:r>
           </w:p>
         </w:tc>
@@ -11184,7 +11375,7 @@
                 <w:b w:val="0"/>
                 <w:sz w:val="15"/>
               </w:rPr>
-              <w:t>Registrar</w:t>
+              <w:t>09:40</w:t>
             </w:r>
           </w:p>
         </w:tc>
@@ -11205,7 +11396,7 @@
                 <w:b w:val="0"/>
                 <w:sz w:val="15"/>
               </w:rPr>
-              <w:t>Registrar</w:t>
+              <w:t>12:10</w:t>
             </w:r>
           </w:p>
         </w:tc>
@@ -11226,7 +11417,7 @@
                 <w:b w:val="0"/>
                 <w:sz w:val="15"/>
               </w:rPr>
-              <w:t>Registrar</w:t>
+              <w:t>15</w:t>
             </w:r>
           </w:p>
         </w:tc>
@@ -11247,7 +11438,7 @@
                 <w:b w:val="0"/>
                 <w:sz w:val="15"/>
               </w:rPr>
-              <w:t>Registrar</w:t>
+              <w:t>135</w:t>
             </w:r>
           </w:p>
         </w:tc>
@@ -11268,7 +11459,7 @@
                 <w:b w:val="0"/>
                 <w:sz w:val="15"/>
               </w:rPr>
-              <w:t>d3dd8e2 · recorridos guiados</w:t>
+              <w:t>Recorridos guiados</w:t>
             </w:r>
           </w:p>
         </w:tc>
@@ -11289,7 +11480,7 @@
                 <w:b w:val="0"/>
                 <w:sz w:val="15"/>
               </w:rPr>
-              <w:t>Bloques, entidad, red, pantallas, datos y comandos</w:t>
+              <w:t>Entidad, red, pantallas, datos y comandos</w:t>
             </w:r>
           </w:p>
         </w:tc>
@@ -11331,7 +11522,7 @@
                 <w:b w:val="0"/>
                 <w:sz w:val="15"/>
               </w:rPr>
-              <w:t>Registrar</w:t>
+              <w:t>13:00</w:t>
             </w:r>
           </w:p>
         </w:tc>
@@ -11351,7 +11542,7 @@
                 <w:b w:val="0"/>
                 <w:sz w:val="15"/>
               </w:rPr>
-              <w:t>Registrar</w:t>
+              <w:t>15:00</w:t>
             </w:r>
           </w:p>
         </w:tc>
@@ -11371,7 +11562,7 @@
                 <w:b w:val="0"/>
                 <w:sz w:val="15"/>
               </w:rPr>
-              <w:t>Registrar</w:t>
+              <w:t>10</w:t>
             </w:r>
           </w:p>
         </w:tc>
@@ -11391,7 +11582,7 @@
                 <w:b w:val="0"/>
                 <w:sz w:val="15"/>
               </w:rPr>
-              <w:t>Registrar</w:t>
+              <w:t>110</w:t>
             </w:r>
           </w:p>
         </w:tc>
@@ -11411,7 +11602,7 @@
                 <w:b w:val="0"/>
                 <w:sz w:val="15"/>
               </w:rPr>
-              <w:t>d074127 · señalización</w:t>
+              <w:t>Señalización</w:t>
             </w:r>
           </w:p>
         </w:tc>
@@ -11475,7 +11666,7 @@
                 <w:b w:val="0"/>
                 <w:sz w:val="15"/>
               </w:rPr>
-              <w:t>Registrar</w:t>
+              <w:t>15:20</w:t>
             </w:r>
           </w:p>
         </w:tc>
@@ -11496,7 +11687,7 @@
                 <w:b w:val="0"/>
                 <w:sz w:val="15"/>
               </w:rPr>
-              <w:t>Registrar</w:t>
+              <w:t>16:50</w:t>
             </w:r>
           </w:p>
         </w:tc>
@@ -11517,7 +11708,7 @@
                 <w:b w:val="0"/>
                 <w:sz w:val="15"/>
               </w:rPr>
-              <w:t>Registrar</w:t>
+              <w:t>10</w:t>
             </w:r>
           </w:p>
         </w:tc>
@@ -11538,7 +11729,7 @@
                 <w:b w:val="0"/>
                 <w:sz w:val="15"/>
               </w:rPr>
-              <w:t>Registrar</w:t>
+              <w:t>80</w:t>
             </w:r>
           </w:p>
         </w:tc>
@@ -11559,7 +11750,7 @@
                 <w:b w:val="0"/>
                 <w:sz w:val="15"/>
               </w:rPr>
-              <w:t>a8942a3 · recursos</w:t>
+              <w:t>Recursos</w:t>
             </w:r>
           </w:p>
         </w:tc>
@@ -11622,7 +11813,7 @@
                 <w:b w:val="0"/>
                 <w:sz w:val="15"/>
               </w:rPr>
-              <w:t>Registrar</w:t>
+              <w:t>17:00</w:t>
             </w:r>
           </w:p>
         </w:tc>
@@ -11642,7 +11833,7 @@
                 <w:b w:val="0"/>
                 <w:sz w:val="15"/>
               </w:rPr>
-              <w:t>Registrar</w:t>
+              <w:t>18:30</w:t>
             </w:r>
           </w:p>
         </w:tc>
@@ -11662,7 +11853,7 @@
                 <w:b w:val="0"/>
                 <w:sz w:val="15"/>
               </w:rPr>
-              <w:t>Registrar</w:t>
+              <w:t>10</w:t>
             </w:r>
           </w:p>
         </w:tc>
@@ -11682,7 +11873,7 @@
                 <w:b w:val="0"/>
                 <w:sz w:val="15"/>
               </w:rPr>
-              <w:t>Registrar</w:t>
+              <w:t>80</w:t>
             </w:r>
           </w:p>
         </w:tc>
@@ -11702,7 +11893,7 @@
                 <w:b w:val="0"/>
                 <w:sz w:val="15"/>
               </w:rPr>
-              <w:t>ddf8cde / fe4633b · builds</w:t>
+              <w:t>Builds</w:t>
             </w:r>
           </w:p>
         </w:tc>
@@ -11766,7 +11957,7 @@
                 <w:b w:val="0"/>
                 <w:sz w:val="15"/>
               </w:rPr>
-              <w:t>Registrar</w:t>
+              <w:t>19:00</w:t>
             </w:r>
           </w:p>
         </w:tc>
@@ -11787,7 +11978,7 @@
                 <w:b w:val="0"/>
                 <w:sz w:val="15"/>
               </w:rPr>
-              <w:t>Registrar</w:t>
+              <w:t>20:20</w:t>
             </w:r>
           </w:p>
         </w:tc>
@@ -11808,7 +11999,7 @@
                 <w:b w:val="0"/>
                 <w:sz w:val="15"/>
               </w:rPr>
-              <w:t>Registrar</w:t>
+              <w:t>5</w:t>
             </w:r>
           </w:p>
         </w:tc>
@@ -11829,7 +12020,7 @@
                 <w:b w:val="0"/>
                 <w:sz w:val="15"/>
               </w:rPr>
-              <w:t>Registrar</w:t>
+              <w:t>75</w:t>
             </w:r>
           </w:p>
         </w:tc>
@@ -11850,7 +12041,7 @@
                 <w:b w:val="0"/>
                 <w:sz w:val="15"/>
               </w:rPr>
-              <w:t>e86b5c0 · integración</w:t>
+              <w:t>Integración</w:t>
             </w:r>
           </w:p>
         </w:tc>
@@ -11871,7 +12062,7 @@
                 <w:b w:val="0"/>
                 <w:sz w:val="15"/>
               </w:rPr>
-              <w:t>Entradas y registros de los mods</w:t>
+              <w:t>Entradas, registros y assets finales</w:t>
             </w:r>
           </w:p>
         </w:tc>
@@ -11893,7 +12084,6 @@
                 <w:b w:val="0"/>
                 <w:sz w:val="15"/>
               </w:rPr>
-              <w:t>21/09/2026</w:t>
             </w:r>
           </w:p>
         </w:tc>
@@ -11913,7 +12103,6 @@
                 <w:b w:val="0"/>
                 <w:sz w:val="15"/>
               </w:rPr>
-              <w:t>Registrar</w:t>
             </w:r>
           </w:p>
         </w:tc>
@@ -11933,7 +12122,6 @@
                 <w:b w:val="0"/>
                 <w:sz w:val="15"/>
               </w:rPr>
-              <w:t>Registrar</w:t>
             </w:r>
           </w:p>
         </w:tc>
@@ -11953,7 +12141,6 @@
                 <w:b w:val="0"/>
                 <w:sz w:val="15"/>
               </w:rPr>
-              <w:t>Registrar</w:t>
             </w:r>
           </w:p>
         </w:tc>
@@ -11973,7 +12160,6 @@
                 <w:b w:val="0"/>
                 <w:sz w:val="15"/>
               </w:rPr>
-              <w:t>Registrar</w:t>
             </w:r>
           </w:p>
         </w:tc>
@@ -11993,7 +12179,6 @@
                 <w:b w:val="0"/>
                 <w:sz w:val="15"/>
               </w:rPr>
-              <w:t>07f85ab / 1176fd4 · assets</w:t>
             </w:r>
           </w:p>
         </w:tc>
@@ -12013,7 +12198,6 @@
                 <w:b w:val="0"/>
                 <w:sz w:val="15"/>
               </w:rPr>
-              <w:t>Señales, rótulos y decoración</w:t>
             </w:r>
           </w:p>
         </w:tc>
@@ -12518,7 +12702,7 @@
                 <w:b w:val="0"/>
                 <w:sz w:val="17"/>
               </w:rPr>
-              <w:t>No calculable sin horas reales</w:t>
+              <w:t>Estimado: 560 min (9.3 h)</w:t>
             </w:r>
           </w:p>
         </w:tc>
@@ -12538,7 +12722,7 @@
                 <w:b w:val="0"/>
                 <w:sz w:val="17"/>
               </w:rPr>
-              <w:t>Revisar el borrador de reflexión individual y ajustarlo con la experiencia personal</w:t>
+              <w:t>Confirmar horarios y ajustar la reflexión con la experiencia personal</w:t>
             </w:r>
           </w:p>
         </w:tc>
@@ -12560,7 +12744,7 @@
         <w:keepNext/>
       </w:pPr>
       <w:r>
-        <w:t>Formulario 1 · Gestión del tiempo</w:t>
+        <w:t>Formulario 1 · Gestión del tiempo · borrador estimado</w:t>
       </w:r>
     </w:p>
     <w:p>
@@ -12588,7 +12772,7 @@
         <w:spacing w:after="120"/>
       </w:pPr>
       <w:r>
-        <w:t>Las tareas y fechas siguientes proceden de Git. El integrante debe registrar sus horas reales, interrupciones y comentarios personales. Delta = (Fin − Inicio) − interrupciones.</w:t>
+        <w:t>Los horarios son una reconstrucción estimada a partir de las tareas y commits; no prueban horas reales. Cada integrante debe confirmarlos o corregirlos. Delta = (Fin − Inicio) − interrupciones.</w:t>
       </w:r>
     </w:p>
     <w:tbl>
@@ -12801,7 +12985,7 @@
                 <w:b w:val="0"/>
                 <w:sz w:val="15"/>
               </w:rPr>
-              <w:t>Registrar</w:t>
+              <w:t>08:30</w:t>
             </w:r>
           </w:p>
         </w:tc>
@@ -12821,7 +13005,7 @@
                 <w:b w:val="0"/>
                 <w:sz w:val="15"/>
               </w:rPr>
-              <w:t>Registrar</w:t>
+              <w:t>11:30</w:t>
             </w:r>
           </w:p>
         </w:tc>
@@ -12841,7 +13025,7 @@
                 <w:b w:val="0"/>
                 <w:sz w:val="15"/>
               </w:rPr>
-              <w:t>Registrar</w:t>
+              <w:t>15</w:t>
             </w:r>
           </w:p>
         </w:tc>
@@ -12861,7 +13045,7 @@
                 <w:b w:val="0"/>
                 <w:sz w:val="15"/>
               </w:rPr>
-              <w:t>Registrar</w:t>
+              <w:t>165</w:t>
             </w:r>
           </w:p>
         </w:tc>
@@ -12881,7 +13065,7 @@
                 <w:b w:val="0"/>
                 <w:sz w:val="15"/>
               </w:rPr>
-              <w:t>9b04036 · estado y navegación</w:t>
+              <w:t>Estado y navegación</w:t>
             </w:r>
           </w:p>
         </w:tc>
@@ -12945,7 +13129,7 @@
                 <w:b w:val="0"/>
                 <w:sz w:val="15"/>
               </w:rPr>
-              <w:t>Registrar</w:t>
+              <w:t>12:30</w:t>
             </w:r>
           </w:p>
         </w:tc>
@@ -12966,7 +13150,7 @@
                 <w:b w:val="0"/>
                 <w:sz w:val="15"/>
               </w:rPr>
-              <w:t>Registrar</w:t>
+              <w:t>15:00</w:t>
             </w:r>
           </w:p>
         </w:tc>
@@ -12987,7 +13171,7 @@
                 <w:b w:val="0"/>
                 <w:sz w:val="15"/>
               </w:rPr>
-              <w:t>Registrar</w:t>
+              <w:t>10</w:t>
             </w:r>
           </w:p>
         </w:tc>
@@ -13008,7 +13192,7 @@
                 <w:b w:val="0"/>
                 <w:sz w:val="15"/>
               </w:rPr>
-              <w:t>Registrar</w:t>
+              <w:t>140</w:t>
             </w:r>
           </w:p>
         </w:tc>
@@ -13029,7 +13213,7 @@
                 <w:b w:val="0"/>
                 <w:sz w:val="15"/>
               </w:rPr>
-              <w:t>6406c2f · interfaz y render</w:t>
+              <w:t>Interfaz y render</w:t>
             </w:r>
           </w:p>
         </w:tc>
@@ -13050,7 +13234,7 @@
                 <w:b w:val="0"/>
                 <w:sz w:val="15"/>
               </w:rPr>
-              <w:t>Pantallas, renderizadores y recursos de University Guide</w:t>
+              <w:t>Pantallas, renderizadores y recursos</w:t>
             </w:r>
           </w:p>
         </w:tc>
@@ -13072,6 +13256,7 @@
                 <w:b w:val="0"/>
                 <w:sz w:val="15"/>
               </w:rPr>
+              <w:t>22/09/2026</w:t>
             </w:r>
           </w:p>
         </w:tc>
@@ -13091,6 +13276,7 @@
                 <w:b w:val="0"/>
                 <w:sz w:val="15"/>
               </w:rPr>
+              <w:t>09:00</w:t>
             </w:r>
           </w:p>
         </w:tc>
@@ -13110,6 +13296,7 @@
                 <w:b w:val="0"/>
                 <w:sz w:val="15"/>
               </w:rPr>
+              <w:t>11:00</w:t>
             </w:r>
           </w:p>
         </w:tc>
@@ -13129,6 +13316,7 @@
                 <w:b w:val="0"/>
                 <w:sz w:val="15"/>
               </w:rPr>
+              <w:t>10</w:t>
             </w:r>
           </w:p>
         </w:tc>
@@ -13148,6 +13336,7 @@
                 <w:b w:val="0"/>
                 <w:sz w:val="15"/>
               </w:rPr>
+              <w:t>110</w:t>
             </w:r>
           </w:p>
         </w:tc>
@@ -13167,6 +13356,7 @@
                 <w:b w:val="0"/>
                 <w:sz w:val="15"/>
               </w:rPr>
+              <w:t>Pruebas de recorrido</w:t>
             </w:r>
           </w:p>
         </w:tc>
@@ -13186,6 +13376,7 @@
                 <w:b w:val="0"/>
                 <w:sz w:val="15"/>
               </w:rPr>
+              <w:t>Revisión de espera, llegada y ruta bloqueada</w:t>
             </w:r>
           </w:p>
         </w:tc>
@@ -13208,6 +13399,7 @@
                 <w:b w:val="0"/>
                 <w:sz w:val="15"/>
               </w:rPr>
+              <w:t>24/09/2026</w:t>
             </w:r>
           </w:p>
         </w:tc>
@@ -13228,6 +13420,7 @@
                 <w:b w:val="0"/>
                 <w:sz w:val="15"/>
               </w:rPr>
+              <w:t>14:00</w:t>
             </w:r>
           </w:p>
         </w:tc>
@@ -13248,6 +13441,7 @@
                 <w:b w:val="0"/>
                 <w:sz w:val="15"/>
               </w:rPr>
+              <w:t>15:30</w:t>
             </w:r>
           </w:p>
         </w:tc>
@@ -13268,6 +13462,7 @@
                 <w:b w:val="0"/>
                 <w:sz w:val="15"/>
               </w:rPr>
+              <w:t>5</w:t>
             </w:r>
           </w:p>
         </w:tc>
@@ -13288,6 +13483,7 @@
                 <w:b w:val="0"/>
                 <w:sz w:val="15"/>
               </w:rPr>
+              <w:t>85</w:t>
             </w:r>
           </w:p>
         </w:tc>
@@ -13308,6 +13504,7 @@
                 <w:b w:val="0"/>
                 <w:sz w:val="15"/>
               </w:rPr>
+              <w:t>Revisión técnica</w:t>
             </w:r>
           </w:p>
         </w:tc>
@@ -13328,6 +13525,7 @@
                 <w:b w:val="0"/>
                 <w:sz w:val="15"/>
               </w:rPr>
+              <w:t>Comprobación de pantallas y reflexión individual</w:t>
             </w:r>
           </w:p>
         </w:tc>
@@ -14244,7 +14442,7 @@
                 <w:b w:val="0"/>
                 <w:sz w:val="17"/>
               </w:rPr>
-              <w:t>No calculable sin horas reales</w:t>
+              <w:t>Estimado: 500 min (8.3 h)</w:t>
             </w:r>
           </w:p>
         </w:tc>
@@ -14264,7 +14462,7 @@
                 <w:b w:val="0"/>
                 <w:sz w:val="17"/>
               </w:rPr>
-              <w:t>Revisar el borrador de reflexión individual y ajustarlo con la experiencia personal</w:t>
+              <w:t>Confirmar horarios y ajustar la reflexión con la experiencia personal</w:t>
             </w:r>
           </w:p>
         </w:tc>
@@ -14286,7 +14484,7 @@
         <w:keepNext/>
       </w:pPr>
       <w:r>
-        <w:t>Formulario 1 · Gestión del tiempo</w:t>
+        <w:t>Formulario 1 · Gestión del tiempo · borrador estimado</w:t>
       </w:r>
     </w:p>
     <w:p>
@@ -14314,7 +14512,7 @@
         <w:spacing w:after="120"/>
       </w:pPr>
       <w:r>
-        <w:t>Las tareas y fechas siguientes proceden de Git. El integrante debe registrar sus horas reales, interrupciones y comentarios personales. Delta = (Fin − Inicio) − interrupciones.</w:t>
+        <w:t>Los horarios son una reconstrucción estimada a partir de las tareas y commits; no prueban horas reales. Cada integrante debe confirmarlos o corregirlos. Delta = (Fin − Inicio) − interrupciones.</w:t>
       </w:r>
     </w:p>
     <w:tbl>
@@ -14527,7 +14725,7 @@
                 <w:b w:val="0"/>
                 <w:sz w:val="15"/>
               </w:rPr>
-              <w:t>Registrar</w:t>
+              <w:t>08:00</w:t>
             </w:r>
           </w:p>
         </w:tc>
@@ -14547,7 +14745,7 @@
                 <w:b w:val="0"/>
                 <w:sz w:val="15"/>
               </w:rPr>
-              <w:t>Registrar</w:t>
+              <w:t>10:30</w:t>
             </w:r>
           </w:p>
         </w:tc>
@@ -14567,7 +14765,7 @@
                 <w:b w:val="0"/>
                 <w:sz w:val="15"/>
               </w:rPr>
-              <w:t>Registrar</w:t>
+              <w:t>10</w:t>
             </w:r>
           </w:p>
         </w:tc>
@@ -14587,7 +14785,7 @@
                 <w:b w:val="0"/>
                 <w:sz w:val="15"/>
               </w:rPr>
-              <w:t>Registrar</w:t>
+              <w:t>140</w:t>
             </w:r>
           </w:p>
         </w:tc>
@@ -14607,7 +14805,7 @@
                 <w:b w:val="0"/>
                 <w:sz w:val="15"/>
               </w:rPr>
-              <w:t>b7a1d72 · señales interactivas</w:t>
+              <w:t>Señales interactivas</w:t>
             </w:r>
           </w:p>
         </w:tc>
@@ -14671,7 +14869,7 @@
                 <w:b w:val="0"/>
                 <w:sz w:val="15"/>
               </w:rPr>
-              <w:t>Registrar</w:t>
+              <w:t>11:00</w:t>
             </w:r>
           </w:p>
         </w:tc>
@@ -14692,7 +14890,7 @@
                 <w:b w:val="0"/>
                 <w:sz w:val="15"/>
               </w:rPr>
-              <w:t>Registrar</w:t>
+              <w:t>14:00</w:t>
             </w:r>
           </w:p>
         </w:tc>
@@ -14713,7 +14911,7 @@
                 <w:b w:val="0"/>
                 <w:sz w:val="15"/>
               </w:rPr>
-              <w:t>Registrar</w:t>
+              <w:t>15</w:t>
             </w:r>
           </w:p>
         </w:tc>
@@ -14734,7 +14932,7 @@
                 <w:b w:val="0"/>
                 <w:sz w:val="15"/>
               </w:rPr>
-              <w:t>Registrar</w:t>
+              <w:t>165</w:t>
             </w:r>
           </w:p>
         </w:tc>
@@ -14755,7 +14953,7 @@
                 <w:b w:val="0"/>
                 <w:sz w:val="15"/>
               </w:rPr>
-              <w:t>27aa5dc · decoración</w:t>
+              <w:t>Decoración</w:t>
             </w:r>
           </w:p>
         </w:tc>
@@ -14798,6 +14996,7 @@
                 <w:b w:val="0"/>
                 <w:sz w:val="15"/>
               </w:rPr>
+              <w:t>23/09/2026</w:t>
             </w:r>
           </w:p>
         </w:tc>
@@ -14817,6 +15016,7 @@
                 <w:b w:val="0"/>
                 <w:sz w:val="15"/>
               </w:rPr>
+              <w:t>09:30</w:t>
             </w:r>
           </w:p>
         </w:tc>
@@ -14836,6 +15036,7 @@
                 <w:b w:val="0"/>
                 <w:sz w:val="15"/>
               </w:rPr>
+              <w:t>11:30</w:t>
             </w:r>
           </w:p>
         </w:tc>
@@ -14855,6 +15056,7 @@
                 <w:b w:val="0"/>
                 <w:sz w:val="15"/>
               </w:rPr>
+              <w:t>10</w:t>
             </w:r>
           </w:p>
         </w:tc>
@@ -14874,6 +15076,7 @@
                 <w:b w:val="0"/>
                 <w:sz w:val="15"/>
               </w:rPr>
+              <w:t>110</w:t>
             </w:r>
           </w:p>
         </w:tc>
@@ -14893,6 +15096,7 @@
                 <w:b w:val="0"/>
                 <w:sz w:val="15"/>
               </w:rPr>
+              <w:t>Pruebas de soporte</w:t>
             </w:r>
           </w:p>
         </w:tc>
@@ -14912,6 +15116,7 @@
                 <w:b w:val="0"/>
                 <w:sz w:val="15"/>
               </w:rPr>
+              <w:t>Colocación, vecinos y eliminación</w:t>
             </w:r>
           </w:p>
         </w:tc>
@@ -14934,6 +15139,7 @@
                 <w:b w:val="0"/>
                 <w:sz w:val="15"/>
               </w:rPr>
+              <w:t>24/09/2026</w:t>
             </w:r>
           </w:p>
         </w:tc>
@@ -14954,6 +15160,7 @@
                 <w:b w:val="0"/>
                 <w:sz w:val="15"/>
               </w:rPr>
+              <w:t>16:00</w:t>
             </w:r>
           </w:p>
         </w:tc>
@@ -14974,6 +15181,7 @@
                 <w:b w:val="0"/>
                 <w:sz w:val="15"/>
               </w:rPr>
+              <w:t>17:20</w:t>
             </w:r>
           </w:p>
         </w:tc>
@@ -14994,6 +15202,7 @@
                 <w:b w:val="0"/>
                 <w:sz w:val="15"/>
               </w:rPr>
+              <w:t>5</w:t>
             </w:r>
           </w:p>
         </w:tc>
@@ -15014,6 +15223,7 @@
                 <w:b w:val="0"/>
                 <w:sz w:val="15"/>
               </w:rPr>
+              <w:t>75</w:t>
             </w:r>
           </w:p>
         </w:tc>
@@ -15034,6 +15244,7 @@
                 <w:b w:val="0"/>
                 <w:sz w:val="15"/>
               </w:rPr>
+              <w:t>Revisión técnica</w:t>
             </w:r>
           </w:p>
         </w:tc>
@@ -15054,6 +15265,7 @@
                 <w:b w:val="0"/>
                 <w:sz w:val="15"/>
               </w:rPr>
+              <w:t>Comprobación del catálogo y reflexión</w:t>
             </w:r>
           </w:p>
         </w:tc>
@@ -15970,7 +16182,7 @@
                 <w:b w:val="0"/>
                 <w:sz w:val="17"/>
               </w:rPr>
-              <w:t>No calculable sin horas reales</w:t>
+              <w:t>Estimado: 490 min (8.2 h)</w:t>
             </w:r>
           </w:p>
         </w:tc>
@@ -15990,7 +16202,7 @@
                 <w:b w:val="0"/>
                 <w:sz w:val="17"/>
               </w:rPr>
-              <w:t>Revisar el borrador de reflexión individual y ajustarlo con la experiencia personal</w:t>
+              <w:t>Confirmar horarios y ajustar la reflexión con la experiencia personal</w:t>
             </w:r>
           </w:p>
         </w:tc>
@@ -16012,7 +16224,7 @@
         <w:keepNext/>
       </w:pPr>
       <w:r>
-        <w:t>Formulario 1 · Gestión del tiempo</w:t>
+        <w:t>Formulario 1 · Gestión del tiempo · borrador estimado</w:t>
       </w:r>
     </w:p>
     <w:p>
@@ -16040,7 +16252,7 @@
         <w:spacing w:after="120"/>
       </w:pPr>
       <w:r>
-        <w:t>Las tareas y fechas siguientes proceden de Git. El integrante debe registrar sus horas reales, interrupciones y comentarios personales. Delta = (Fin − Inicio) − interrupciones.</w:t>
+        <w:t>Los horarios son una reconstrucción estimada a partir de las tareas y commits; no prueban horas reales. Cada integrante debe confirmarlos o corregirlos. Delta = (Fin − Inicio) − interrupciones.</w:t>
       </w:r>
     </w:p>
     <w:tbl>
@@ -16253,7 +16465,7 @@
                 <w:b w:val="0"/>
                 <w:sz w:val="15"/>
               </w:rPr>
-              <w:t>Registrar</w:t>
+              <w:t>08:00</w:t>
             </w:r>
           </w:p>
         </w:tc>
@@ -16273,7 +16485,7 @@
                 <w:b w:val="0"/>
                 <w:sz w:val="15"/>
               </w:rPr>
-              <w:t>Registrar</w:t>
+              <w:t>10:30</w:t>
             </w:r>
           </w:p>
         </w:tc>
@@ -16293,7 +16505,7 @@
                 <w:b w:val="0"/>
                 <w:sz w:val="15"/>
               </w:rPr>
-              <w:t>Registrar</w:t>
+              <w:t>10</w:t>
             </w:r>
           </w:p>
         </w:tc>
@@ -16313,7 +16525,7 @@
                 <w:b w:val="0"/>
                 <w:sz w:val="15"/>
               </w:rPr>
-              <w:t>Registrar</w:t>
+              <w:t>140</w:t>
             </w:r>
           </w:p>
         </w:tc>
@@ -16333,7 +16545,7 @@
                 <w:b w:val="0"/>
                 <w:sz w:val="15"/>
               </w:rPr>
-              <w:t>a55825b · señales</w:t>
+              <w:t>Recursos de señales</w:t>
             </w:r>
           </w:p>
         </w:tc>
@@ -16353,7 +16565,7 @@
                 <w:b w:val="0"/>
                 <w:sz w:val="15"/>
               </w:rPr>
-              <w:t>Recursos de seguridad, dirección y sanitarios</w:t>
+              <w:t>Seguridad, dirección y sanitarios</w:t>
             </w:r>
           </w:p>
         </w:tc>
@@ -16397,7 +16609,7 @@
                 <w:b w:val="0"/>
                 <w:sz w:val="15"/>
               </w:rPr>
-              <w:t>Registrar</w:t>
+              <w:t>11:00</w:t>
             </w:r>
           </w:p>
         </w:tc>
@@ -16418,7 +16630,7 @@
                 <w:b w:val="0"/>
                 <w:sz w:val="15"/>
               </w:rPr>
-              <w:t>Registrar</w:t>
+              <w:t>14:00</w:t>
             </w:r>
           </w:p>
         </w:tc>
@@ -16439,7 +16651,7 @@
                 <w:b w:val="0"/>
                 <w:sz w:val="15"/>
               </w:rPr>
-              <w:t>Registrar</w:t>
+              <w:t>15</w:t>
             </w:r>
           </w:p>
         </w:tc>
@@ -16460,7 +16672,7 @@
                 <w:b w:val="0"/>
                 <w:sz w:val="15"/>
               </w:rPr>
-              <w:t>Registrar</w:t>
+              <w:t>165</w:t>
             </w:r>
           </w:p>
         </w:tc>
@@ -16481,7 +16693,7 @@
                 <w:b w:val="0"/>
                 <w:sz w:val="15"/>
               </w:rPr>
-              <w:t>96b03dc · decoración</w:t>
+              <w:t>Recursos decorativos</w:t>
             </w:r>
           </w:p>
         </w:tc>
@@ -16502,7 +16714,7 @@
                 <w:b w:val="0"/>
                 <w:sz w:val="15"/>
               </w:rPr>
-              <w:t>Rótulos personalizables, macetero, mural y validador</w:t>
+              <w:t>Rótulos, macetero, mural y validador</w:t>
             </w:r>
           </w:p>
         </w:tc>
@@ -16524,6 +16736,7 @@
                 <w:b w:val="0"/>
                 <w:sz w:val="15"/>
               </w:rPr>
+              <w:t>24/09/2026</w:t>
             </w:r>
           </w:p>
         </w:tc>
@@ -16543,6 +16756,7 @@
                 <w:b w:val="0"/>
                 <w:sz w:val="15"/>
               </w:rPr>
+              <w:t>08:30</w:t>
             </w:r>
           </w:p>
         </w:tc>
@@ -16562,6 +16776,7 @@
                 <w:b w:val="0"/>
                 <w:sz w:val="15"/>
               </w:rPr>
+              <w:t>10:00</w:t>
             </w:r>
           </w:p>
         </w:tc>
@@ -16581,6 +16796,7 @@
                 <w:b w:val="0"/>
                 <w:sz w:val="15"/>
               </w:rPr>
+              <w:t>5</w:t>
             </w:r>
           </w:p>
         </w:tc>
@@ -16600,6 +16816,7 @@
                 <w:b w:val="0"/>
                 <w:sz w:val="15"/>
               </w:rPr>
+              <w:t>85</w:t>
             </w:r>
           </w:p>
         </w:tc>
@@ -16619,6 +16836,7 @@
                 <w:b w:val="0"/>
                 <w:sz w:val="15"/>
               </w:rPr>
+              <w:t>Reorganización</w:t>
             </w:r>
           </w:p>
         </w:tc>
@@ -16638,6 +16856,7 @@
                 <w:b w:val="0"/>
                 <w:sz w:val="15"/>
               </w:rPr>
+              <w:t>Traslado de los mods al workspace compartido</w:t>
             </w:r>
           </w:p>
         </w:tc>
@@ -16660,6 +16879,7 @@
                 <w:b w:val="0"/>
                 <w:sz w:val="15"/>
               </w:rPr>
+              <w:t>24/09/2026</w:t>
             </w:r>
           </w:p>
         </w:tc>
@@ -16680,6 +16900,7 @@
                 <w:b w:val="0"/>
                 <w:sz w:val="15"/>
               </w:rPr>
+              <w:t>10:15</w:t>
             </w:r>
           </w:p>
         </w:tc>
@@ -16700,6 +16921,7 @@
                 <w:b w:val="0"/>
                 <w:sz w:val="15"/>
               </w:rPr>
+              <w:t>11:45</w:t>
             </w:r>
           </w:p>
         </w:tc>
@@ -16720,6 +16942,7 @@
                 <w:b w:val="0"/>
                 <w:sz w:val="15"/>
               </w:rPr>
+              <w:t>10</w:t>
             </w:r>
           </w:p>
         </w:tc>
@@ -16740,6 +16963,7 @@
                 <w:b w:val="0"/>
                 <w:sz w:val="15"/>
               </w:rPr>
+              <w:t>80</w:t>
             </w:r>
           </w:p>
         </w:tc>
@@ -16760,6 +16984,7 @@
                 <w:b w:val="0"/>
                 <w:sz w:val="15"/>
               </w:rPr>
+              <w:t>Compilación</w:t>
             </w:r>
           </w:p>
         </w:tc>
@@ -16780,6 +17005,7 @@
                 <w:b w:val="0"/>
                 <w:sz w:val="15"/>
               </w:rPr>
+              <w:t>Herramienta para construir ambos módulos</w:t>
             </w:r>
           </w:p>
         </w:tc>
@@ -16801,6 +17027,7 @@
                 <w:b w:val="0"/>
                 <w:sz w:val="15"/>
               </w:rPr>
+              <w:t>24/09/2026</w:t>
             </w:r>
           </w:p>
         </w:tc>
@@ -16820,6 +17047,7 @@
                 <w:b w:val="0"/>
                 <w:sz w:val="15"/>
               </w:rPr>
+              <w:t>13:00</w:t>
             </w:r>
           </w:p>
         </w:tc>
@@ -16839,6 +17067,7 @@
                 <w:b w:val="0"/>
                 <w:sz w:val="15"/>
               </w:rPr>
+              <w:t>16:00</w:t>
             </w:r>
           </w:p>
         </w:tc>
@@ -16858,6 +17087,7 @@
                 <w:b w:val="0"/>
                 <w:sz w:val="15"/>
               </w:rPr>
+              <w:t>15</w:t>
             </w:r>
           </w:p>
         </w:tc>
@@ -16877,6 +17107,7 @@
                 <w:b w:val="0"/>
                 <w:sz w:val="15"/>
               </w:rPr>
+              <w:t>165</w:t>
             </w:r>
           </w:p>
         </w:tc>
@@ -16896,6 +17127,7 @@
                 <w:b w:val="0"/>
                 <w:sz w:val="15"/>
               </w:rPr>
+              <w:t>Documento de entrega</w:t>
             </w:r>
           </w:p>
         </w:tc>
@@ -16915,6 +17147,7 @@
                 <w:b w:val="0"/>
                 <w:sz w:val="15"/>
               </w:rPr>
+              <w:t>Generador, revisión de rúbrica y evidencias</w:t>
             </w:r>
           </w:p>
         </w:tc>
@@ -17696,7 +17929,7 @@
                 <w:b w:val="0"/>
                 <w:sz w:val="17"/>
               </w:rPr>
-              <w:t>No calculable sin horas reales</w:t>
+              <w:t>Estimado: 635 min (10.6 h)</w:t>
             </w:r>
           </w:p>
         </w:tc>
@@ -17716,7 +17949,7 @@
                 <w:b w:val="0"/>
                 <w:sz w:val="17"/>
               </w:rPr>
-              <w:t>Revisar el borrador de reflexión individual y ajustarlo con la experiencia personal</w:t>
+              <w:t>Confirmar horarios y ajustar la reflexión con la experiencia personal</w:t>
             </w:r>
           </w:p>
         </w:tc>
@@ -18218,7 +18451,7 @@
                 <w:b w:val="0"/>
                 <w:sz w:val="16"/>
               </w:rPr>
-              <w:t>Diego, Oscar y Ricardo</w:t>
+              <w:t>Diego y Oscar</w:t>
             </w:r>
           </w:p>
         </w:tc>
@@ -18528,6 +18761,667 @@
             </w:r>
             <w:r>
               <w:t>El contenido técnico y la actividad de Git ya están incorporados. Solo quedan datos personales no publicados, horas reales, confirmación de reflexiones y sesiones con usuarios.</w:t>
+            </w:r>
+          </w:p>
+        </w:tc>
+      </w:tr>
+    </w:tbl>
+    <w:p>
+      <w:pPr>
+        <w:spacing w:after="0"/>
+      </w:pPr>
+    </w:p>
+    <w:p>
+      <w:pPr>
+        <w:pStyle w:val="Heading1"/>
+        <w:keepNext/>
+      </w:pPr>
+      <w:r>
+        <w:t>9. Trazabilidad con la rúbrica</w:t>
+      </w:r>
+    </w:p>
+    <w:tbl>
+      <w:tblPr>
+        <w:tblStyle w:val="TableGrid"/>
+        <w:tblW w:type="auto" w:w="0"/>
+        <w:jc w:val="center"/>
+        <w:tblLayout w:type="fixed"/>
+        <w:tblLook w:firstColumn="1" w:firstRow="1" w:lastColumn="0" w:lastRow="0" w:noHBand="0" w:noVBand="1" w:val="04A0"/>
+      </w:tblPr>
+      <w:tblGrid>
+        <w:gridCol w:w="2592"/>
+        <w:gridCol w:w="2592"/>
+        <w:gridCol w:w="2592"/>
+        <w:gridCol w:w="2592"/>
+      </w:tblGrid>
+      <w:tr>
+        <w:tc>
+          <w:tcPr>
+            <w:tcW w:type="dxa" w:w="2880"/>
+            <w:vAlign w:val="center"/>
+            <w:shd w:fill="00563F"/>
+          </w:tcPr>
+          <w:p>
+            <w:pPr>
+              <w:spacing w:after="0"/>
+            </w:pPr>
+            <w:r/>
+            <w:r>
+              <w:rPr>
+                <w:rFonts w:ascii="Aptos" w:hAnsi="Aptos"/>
+                <w:b/>
+                <w:color w:val="FFFFFF"/>
+                <w:sz w:val="16"/>
+              </w:rPr>
+              <w:t>Criterio</w:t>
+            </w:r>
+          </w:p>
+        </w:tc>
+        <w:tc>
+          <w:tcPr>
+            <w:tcW w:type="dxa" w:w="936"/>
+            <w:vAlign w:val="center"/>
+            <w:shd w:fill="00563F"/>
+          </w:tcPr>
+          <w:p>
+            <w:pPr>
+              <w:spacing w:after="0"/>
+            </w:pPr>
+            <w:r/>
+            <w:r>
+              <w:rPr>
+                <w:rFonts w:ascii="Aptos" w:hAnsi="Aptos"/>
+                <w:b/>
+                <w:color w:val="FFFFFF"/>
+                <w:sz w:val="16"/>
+              </w:rPr>
+              <w:t>Puntos</w:t>
+            </w:r>
+          </w:p>
+        </w:tc>
+        <w:tc>
+          <w:tcPr>
+            <w:tcW w:type="dxa" w:w="4680"/>
+            <w:vAlign w:val="center"/>
+            <w:shd w:fill="00563F"/>
+          </w:tcPr>
+          <w:p>
+            <w:pPr>
+              <w:spacing w:after="0"/>
+            </w:pPr>
+            <w:r/>
+            <w:r>
+              <w:rPr>
+                <w:rFonts w:ascii="Aptos" w:hAnsi="Aptos"/>
+                <w:b/>
+                <w:color w:val="FFFFFF"/>
+                <w:sz w:val="16"/>
+              </w:rPr>
+              <w:t>Ubicación en este documento</w:t>
+            </w:r>
+          </w:p>
+        </w:tc>
+        <w:tc>
+          <w:tcPr>
+            <w:tcW w:type="dxa" w:w="2160"/>
+            <w:vAlign w:val="center"/>
+            <w:shd w:fill="00563F"/>
+          </w:tcPr>
+          <w:p>
+            <w:pPr>
+              <w:spacing w:after="0"/>
+            </w:pPr>
+            <w:r/>
+            <w:r>
+              <w:rPr>
+                <w:rFonts w:ascii="Aptos" w:hAnsi="Aptos"/>
+                <w:b/>
+                <w:color w:val="FFFFFF"/>
+                <w:sz w:val="16"/>
+              </w:rPr>
+              <w:t>Estado</w:t>
+            </w:r>
+          </w:p>
+        </w:tc>
+      </w:tr>
+      <w:tr>
+        <w:tc>
+          <w:tcPr>
+            <w:tcW w:type="dxa" w:w="2880"/>
+            <w:vAlign w:val="center"/>
+          </w:tcPr>
+          <w:p>
+            <w:pPr>
+              <w:spacing w:after="0"/>
+            </w:pPr>
+            <w:r/>
+            <w:r>
+              <w:rPr>
+                <w:rFonts w:ascii="Aptos" w:hAnsi="Aptos"/>
+                <w:b w:val="0"/>
+                <w:sz w:val="16"/>
+              </w:rPr>
+              <w:t>Requisitos priorizados</w:t>
+            </w:r>
+          </w:p>
+        </w:tc>
+        <w:tc>
+          <w:tcPr>
+            <w:tcW w:type="dxa" w:w="936"/>
+            <w:vAlign w:val="center"/>
+          </w:tcPr>
+          <w:p>
+            <w:pPr>
+              <w:spacing w:after="0"/>
+            </w:pPr>
+            <w:r/>
+            <w:r>
+              <w:rPr>
+                <w:rFonts w:ascii="Aptos" w:hAnsi="Aptos"/>
+                <w:b w:val="0"/>
+                <w:sz w:val="16"/>
+              </w:rPr>
+              <w:t>15</w:t>
+            </w:r>
+          </w:p>
+        </w:tc>
+        <w:tc>
+          <w:tcPr>
+            <w:tcW w:type="dxa" w:w="4680"/>
+            <w:vAlign w:val="center"/>
+          </w:tcPr>
+          <w:p>
+            <w:pPr>
+              <w:spacing w:after="0"/>
+            </w:pPr>
+            <w:r/>
+            <w:r>
+              <w:rPr>
+                <w:rFonts w:ascii="Aptos" w:hAnsi="Aptos"/>
+                <w:b w:val="0"/>
+                <w:sz w:val="16"/>
+              </w:rPr>
+              <w:t>Sección 1: prioridad, aceptación, responsable y estado</w:t>
+            </w:r>
+          </w:p>
+        </w:tc>
+        <w:tc>
+          <w:tcPr>
+            <w:tcW w:type="dxa" w:w="2160"/>
+            <w:vAlign w:val="center"/>
+          </w:tcPr>
+          <w:p>
+            <w:pPr>
+              <w:spacing w:after="0"/>
+            </w:pPr>
+            <w:r/>
+            <w:r>
+              <w:rPr>
+                <w:rFonts w:ascii="Aptos" w:hAnsi="Aptos"/>
+                <w:b w:val="0"/>
+                <w:sz w:val="16"/>
+              </w:rPr>
+              <w:t>Completo</w:t>
+            </w:r>
+          </w:p>
+        </w:tc>
+      </w:tr>
+      <w:tr>
+        <w:tc>
+          <w:tcPr>
+            <w:tcW w:type="dxa" w:w="2880"/>
+            <w:vAlign w:val="center"/>
+            <w:shd w:fill="F7F9F8"/>
+          </w:tcPr>
+          <w:p>
+            <w:pPr>
+              <w:spacing w:after="0"/>
+            </w:pPr>
+            <w:r/>
+            <w:r>
+              <w:rPr>
+                <w:rFonts w:ascii="Aptos" w:hAnsi="Aptos"/>
+                <w:b w:val="0"/>
+                <w:sz w:val="16"/>
+              </w:rPr>
+              <w:t>Planificación</w:t>
+            </w:r>
+          </w:p>
+        </w:tc>
+        <w:tc>
+          <w:tcPr>
+            <w:tcW w:type="dxa" w:w="936"/>
+            <w:vAlign w:val="center"/>
+            <w:shd w:fill="F7F9F8"/>
+          </w:tcPr>
+          <w:p>
+            <w:pPr>
+              <w:spacing w:after="0"/>
+            </w:pPr>
+            <w:r/>
+            <w:r>
+              <w:rPr>
+                <w:rFonts w:ascii="Aptos" w:hAnsi="Aptos"/>
+                <w:b w:val="0"/>
+                <w:sz w:val="16"/>
+              </w:rPr>
+              <w:t>10</w:t>
+            </w:r>
+          </w:p>
+        </w:tc>
+        <w:tc>
+          <w:tcPr>
+            <w:tcW w:type="dxa" w:w="4680"/>
+            <w:vAlign w:val="center"/>
+            <w:shd w:fill="F7F9F8"/>
+          </w:tcPr>
+          <w:p>
+            <w:pPr>
+              <w:spacing w:after="0"/>
+            </w:pPr>
+            <w:r/>
+            <w:r>
+              <w:rPr>
+                <w:rFonts w:ascii="Aptos" w:hAnsi="Aptos"/>
+                <w:b w:val="0"/>
+                <w:sz w:val="16"/>
+              </w:rPr>
+              <w:t>Sección 3: T01–T17 y calendario</w:t>
+            </w:r>
+          </w:p>
+        </w:tc>
+        <w:tc>
+          <w:tcPr>
+            <w:tcW w:type="dxa" w:w="2160"/>
+            <w:vAlign w:val="center"/>
+            <w:shd w:fill="F7F9F8"/>
+          </w:tcPr>
+          <w:p>
+            <w:pPr>
+              <w:spacing w:after="0"/>
+            </w:pPr>
+            <w:r/>
+            <w:r>
+              <w:rPr>
+                <w:rFonts w:ascii="Aptos" w:hAnsi="Aptos"/>
+                <w:b w:val="0"/>
+                <w:sz w:val="16"/>
+              </w:rPr>
+              <w:t>Completo</w:t>
+            </w:r>
+          </w:p>
+        </w:tc>
+      </w:tr>
+      <w:tr>
+        <w:tc>
+          <w:tcPr>
+            <w:tcW w:type="dxa" w:w="2880"/>
+            <w:vAlign w:val="center"/>
+          </w:tcPr>
+          <w:p>
+            <w:pPr>
+              <w:spacing w:after="0"/>
+            </w:pPr>
+            <w:r/>
+            <w:r>
+              <w:rPr>
+                <w:rFonts w:ascii="Aptos" w:hAnsi="Aptos"/>
+                <w:b w:val="0"/>
+                <w:sz w:val="16"/>
+              </w:rPr>
+              <w:t>Investigación de persistencia</w:t>
+            </w:r>
+          </w:p>
+        </w:tc>
+        <w:tc>
+          <w:tcPr>
+            <w:tcW w:type="dxa" w:w="936"/>
+            <w:vAlign w:val="center"/>
+          </w:tcPr>
+          <w:p>
+            <w:pPr>
+              <w:spacing w:after="0"/>
+            </w:pPr>
+            <w:r/>
+            <w:r>
+              <w:rPr>
+                <w:rFonts w:ascii="Aptos" w:hAnsi="Aptos"/>
+                <w:b w:val="0"/>
+                <w:sz w:val="16"/>
+              </w:rPr>
+              <w:t>7</w:t>
+            </w:r>
+          </w:p>
+        </w:tc>
+        <w:tc>
+          <w:tcPr>
+            <w:tcW w:type="dxa" w:w="4680"/>
+            <w:vAlign w:val="center"/>
+          </w:tcPr>
+          <w:p>
+            <w:pPr>
+              <w:spacing w:after="0"/>
+            </w:pPr>
+            <w:r/>
+            <w:r>
+              <w:rPr>
+                <w:rFonts w:ascii="Aptos" w:hAnsi="Aptos"/>
+                <w:b w:val="0"/>
+                <w:sz w:val="16"/>
+              </w:rPr>
+              <w:t>Sección 2: comparación, decisión, prueba y fuentes</w:t>
+            </w:r>
+          </w:p>
+        </w:tc>
+        <w:tc>
+          <w:tcPr>
+            <w:tcW w:type="dxa" w:w="2160"/>
+            <w:vAlign w:val="center"/>
+          </w:tcPr>
+          <w:p>
+            <w:pPr>
+              <w:spacing w:after="0"/>
+            </w:pPr>
+            <w:r/>
+            <w:r>
+              <w:rPr>
+                <w:rFonts w:ascii="Aptos" w:hAnsi="Aptos"/>
+                <w:b w:val="0"/>
+                <w:sz w:val="16"/>
+              </w:rPr>
+              <w:t>Completo</w:t>
+            </w:r>
+          </w:p>
+        </w:tc>
+      </w:tr>
+      <w:tr>
+        <w:tc>
+          <w:tcPr>
+            <w:tcW w:type="dxa" w:w="2880"/>
+            <w:vAlign w:val="center"/>
+            <w:shd w:fill="F7F9F8"/>
+          </w:tcPr>
+          <w:p>
+            <w:pPr>
+              <w:spacing w:after="0"/>
+            </w:pPr>
+            <w:r/>
+            <w:r>
+              <w:rPr>
+                <w:rFonts w:ascii="Aptos" w:hAnsi="Aptos"/>
+                <w:b w:val="0"/>
+                <w:sz w:val="16"/>
+              </w:rPr>
+              <w:t>Implementación</w:t>
+            </w:r>
+          </w:p>
+        </w:tc>
+        <w:tc>
+          <w:tcPr>
+            <w:tcW w:type="dxa" w:w="936"/>
+            <w:vAlign w:val="center"/>
+            <w:shd w:fill="F7F9F8"/>
+          </w:tcPr>
+          <w:p>
+            <w:pPr>
+              <w:spacing w:after="0"/>
+            </w:pPr>
+            <w:r/>
+            <w:r>
+              <w:rPr>
+                <w:rFonts w:ascii="Aptos" w:hAnsi="Aptos"/>
+                <w:b w:val="0"/>
+                <w:sz w:val="16"/>
+              </w:rPr>
+              <w:t>40</w:t>
+            </w:r>
+          </w:p>
+        </w:tc>
+        <w:tc>
+          <w:tcPr>
+            <w:tcW w:type="dxa" w:w="4680"/>
+            <w:vAlign w:val="center"/>
+            <w:shd w:fill="F7F9F8"/>
+          </w:tcPr>
+          <w:p>
+            <w:pPr>
+              <w:spacing w:after="0"/>
+            </w:pPr>
+            <w:r/>
+            <w:r>
+              <w:rPr>
+                <w:rFonts w:ascii="Aptos" w:hAnsi="Aptos"/>
+                <w:b w:val="0"/>
+                <w:sz w:val="16"/>
+              </w:rPr>
+              <w:t>Sección 4: evidencia estática y pendientes manuales</w:t>
+            </w:r>
+          </w:p>
+        </w:tc>
+        <w:tc>
+          <w:tcPr>
+            <w:tcW w:type="dxa" w:w="2160"/>
+            <w:vAlign w:val="center"/>
+            <w:shd w:fill="F7F9F8"/>
+          </w:tcPr>
+          <w:p>
+            <w:pPr>
+              <w:spacing w:after="0"/>
+            </w:pPr>
+            <w:r/>
+            <w:r>
+              <w:rPr>
+                <w:rFonts w:ascii="Aptos" w:hAnsi="Aptos"/>
+                <w:b w:val="0"/>
+                <w:sz w:val="16"/>
+              </w:rPr>
+              <w:t>Parcial: falta prueba en juego</w:t>
+            </w:r>
+          </w:p>
+        </w:tc>
+      </w:tr>
+      <w:tr>
+        <w:tc>
+          <w:tcPr>
+            <w:tcW w:type="dxa" w:w="2880"/>
+            <w:vAlign w:val="center"/>
+          </w:tcPr>
+          <w:p>
+            <w:pPr>
+              <w:spacing w:after="0"/>
+            </w:pPr>
+            <w:r/>
+            <w:r>
+              <w:rPr>
+                <w:rFonts w:ascii="Aptos" w:hAnsi="Aptos"/>
+                <w:b w:val="0"/>
+                <w:sz w:val="16"/>
+              </w:rPr>
+              <w:t>Control de versiones</w:t>
+            </w:r>
+          </w:p>
+        </w:tc>
+        <w:tc>
+          <w:tcPr>
+            <w:tcW w:type="dxa" w:w="936"/>
+            <w:vAlign w:val="center"/>
+          </w:tcPr>
+          <w:p>
+            <w:pPr>
+              <w:spacing w:after="0"/>
+            </w:pPr>
+            <w:r/>
+            <w:r>
+              <w:rPr>
+                <w:rFonts w:ascii="Aptos" w:hAnsi="Aptos"/>
+                <w:b w:val="0"/>
+                <w:sz w:val="16"/>
+              </w:rPr>
+              <w:t>20</w:t>
+            </w:r>
+          </w:p>
+        </w:tc>
+        <w:tc>
+          <w:tcPr>
+            <w:tcW w:type="dxa" w:w="4680"/>
+            <w:vAlign w:val="center"/>
+          </w:tcPr>
+          <w:p>
+            <w:pPr>
+              <w:spacing w:after="0"/>
+            </w:pPr>
+            <w:r/>
+            <w:r>
+              <w:rPr>
+                <w:rFonts w:ascii="Aptos" w:hAnsi="Aptos"/>
+                <w:b w:val="0"/>
+                <w:sz w:val="16"/>
+              </w:rPr>
+              <w:t>Sección 5: repositorio y actividad por autor</w:t>
+            </w:r>
+          </w:p>
+        </w:tc>
+        <w:tc>
+          <w:tcPr>
+            <w:tcW w:type="dxa" w:w="2160"/>
+            <w:vAlign w:val="center"/>
+          </w:tcPr>
+          <w:p>
+            <w:pPr>
+              <w:spacing w:after="0"/>
+            </w:pPr>
+            <w:r/>
+            <w:r>
+              <w:rPr>
+                <w:rFonts w:ascii="Aptos" w:hAnsi="Aptos"/>
+                <w:b w:val="0"/>
+                <w:sz w:val="16"/>
+              </w:rPr>
+              <w:t>En riesgo: rama sin subir y 2 autores</w:t>
+            </w:r>
+          </w:p>
+        </w:tc>
+      </w:tr>
+      <w:tr>
+        <w:tc>
+          <w:tcPr>
+            <w:tcW w:type="dxa" w:w="2880"/>
+            <w:vAlign w:val="center"/>
+            <w:shd w:fill="F7F9F8"/>
+          </w:tcPr>
+          <w:p>
+            <w:pPr>
+              <w:spacing w:after="0"/>
+            </w:pPr>
+            <w:r/>
+            <w:r>
+              <w:rPr>
+                <w:rFonts w:ascii="Aptos" w:hAnsi="Aptos"/>
+                <w:b w:val="0"/>
+                <w:sz w:val="16"/>
+              </w:rPr>
+              <w:t>Gestión</w:t>
+            </w:r>
+          </w:p>
+        </w:tc>
+        <w:tc>
+          <w:tcPr>
+            <w:tcW w:type="dxa" w:w="936"/>
+            <w:vAlign w:val="center"/>
+            <w:shd w:fill="F7F9F8"/>
+          </w:tcPr>
+          <w:p>
+            <w:pPr>
+              <w:spacing w:after="0"/>
+            </w:pPr>
+            <w:r/>
+            <w:r>
+              <w:rPr>
+                <w:rFonts w:ascii="Aptos" w:hAnsi="Aptos"/>
+                <w:b w:val="0"/>
+                <w:sz w:val="16"/>
+              </w:rPr>
+              <w:t>8</w:t>
+            </w:r>
+          </w:p>
+        </w:tc>
+        <w:tc>
+          <w:tcPr>
+            <w:tcW w:type="dxa" w:w="4680"/>
+            <w:vAlign w:val="center"/>
+            <w:shd w:fill="F7F9F8"/>
+          </w:tcPr>
+          <w:p>
+            <w:pPr>
+              <w:spacing w:after="0"/>
+            </w:pPr>
+            <w:r/>
+            <w:r>
+              <w:rPr>
+                <w:rFonts w:ascii="Aptos" w:hAnsi="Aptos"/>
+                <w:b w:val="0"/>
+                <w:sz w:val="16"/>
+              </w:rPr>
+              <w:t>Secciones 3, 6, 7 y formularios individuales</w:t>
+            </w:r>
+          </w:p>
+        </w:tc>
+        <w:tc>
+          <w:tcPr>
+            <w:tcW w:type="dxa" w:w="2160"/>
+            <w:vAlign w:val="center"/>
+            <w:shd w:fill="F7F9F8"/>
+          </w:tcPr>
+          <w:p>
+            <w:pPr>
+              <w:spacing w:after="0"/>
+            </w:pPr>
+            <w:r/>
+            <w:r>
+              <w:rPr>
+                <w:rFonts w:ascii="Aptos" w:hAnsi="Aptos"/>
+                <w:b w:val="0"/>
+                <w:sz w:val="16"/>
+              </w:rPr>
+              <w:t>Parcial: faltan tiempos y usuarios reales</w:t>
+            </w:r>
+          </w:p>
+        </w:tc>
+      </w:tr>
+    </w:tbl>
+    <w:p>
+      <w:pPr>
+        <w:spacing w:after="0"/>
+      </w:pPr>
+    </w:p>
+    <w:tbl>
+      <w:tblPr>
+        <w:tblStyle w:val="TableGrid"/>
+        <w:tblW w:type="auto" w:w="0"/>
+        <w:tblLook w:firstColumn="1" w:firstRow="1" w:lastColumn="0" w:lastRow="0" w:noHBand="0" w:noVBand="1" w:val="04A0"/>
+      </w:tblPr>
+      <w:tblGrid>
+        <w:gridCol w:w="10368"/>
+      </w:tblGrid>
+      <w:tr>
+        <w:tc>
+          <w:tcPr>
+            <w:tcW w:type="dxa" w:w="10368"/>
+            <w:shd w:fill="FFF4CC"/>
+          </w:tcPr>
+          <w:p>
+            <w:pPr>
+              <w:spacing w:after="0"/>
+            </w:pPr>
+            <w:r>
+              <w:rPr>
+                <w:b/>
+                <w:color w:val="00563F"/>
+              </w:rPr>
+              <w:t xml:space="preserve">Uso de esta tabla: </w:t>
+            </w:r>
+            <w:r>
+              <w:t>Los estados parciales no deben cambiarse a completos hasta incorporar evidencia real. La tabla permite revisar la entrega sin confundir contenido preparado con actividad ejecutada.</w:t>
             </w:r>
           </w:p>
         </w:tc>

</xml_diff>

<commit_message>
docs(delivery): update verified contribution counts
</commit_message>
<xml_diff>
--- a/entrega-3/Entrega 3 - UVG Minecraft Mods.docx
+++ b/entrega-3/Entrega 3 - UVG Minecraft Mods.docx
@@ -963,7 +963,7 @@
         </w:tc>
         <w:tc>
           <w:tcPr>
-            <w:tcW w:type="dxa" w:w="1152"/>
+            <w:tcW w:type="dxa" w:w="1440"/>
             <w:vAlign w:val="center"/>
             <w:shd w:fill="00563F"/>
           </w:tcPr>
@@ -979,13 +979,13 @@
                 <w:color w:val="FFFFFF"/>
                 <w:sz w:val="17"/>
               </w:rPr>
-              <w:t>Commits</w:t>
-            </w:r>
-          </w:p>
-        </w:tc>
-        <w:tc>
-          <w:tcPr>
-            <w:tcW w:type="dxa" w:w="1800"/>
+              <w:t>Commits en main</w:t>
+            </w:r>
+          </w:p>
+        </w:tc>
+        <w:tc>
+          <w:tcPr>
+            <w:tcW w:type="dxa" w:w="5112"/>
             <w:vAlign w:val="center"/>
             <w:shd w:fill="00563F"/>
           </w:tcPr>
@@ -1001,13 +1001,13 @@
                 <w:color w:val="FFFFFF"/>
                 <w:sz w:val="17"/>
               </w:rPr>
-              <w:t>Líneas añadidas*</w:t>
-            </w:r>
-          </w:p>
-        </w:tc>
-        <w:tc>
-          <w:tcPr>
-            <w:tcW w:type="dxa" w:w="4968"/>
+              <w:t>Áreas observadas</w:t>
+            </w:r>
+          </w:p>
+        </w:tc>
+        <w:tc>
+          <w:tcPr>
+            <w:tcW w:type="dxa" w:w="1368"/>
             <w:vAlign w:val="center"/>
             <w:shd w:fill="00563F"/>
           </w:tcPr>
@@ -1023,7 +1023,7 @@
                 <w:color w:val="FFFFFF"/>
                 <w:sz w:val="17"/>
               </w:rPr>
-              <w:t>Áreas observadas</w:t>
+              <w:t>Criterio &gt;3</w:t>
             </w:r>
           </w:p>
         </w:tc>
@@ -1051,7 +1051,7 @@
         </w:tc>
         <w:tc>
           <w:tcPr>
-            <w:tcW w:type="dxa" w:w="1152"/>
+            <w:tcW w:type="dxa" w:w="1440"/>
             <w:vAlign w:val="center"/>
           </w:tcPr>
           <w:p>
@@ -1065,13 +1065,13 @@
                 <w:b w:val="0"/>
                 <w:sz w:val="17"/>
               </w:rPr>
-              <w:t>9</w:t>
-            </w:r>
-          </w:p>
-        </w:tc>
-        <w:tc>
-          <w:tcPr>
-            <w:tcW w:type="dxa" w:w="1800"/>
+              <w:t>4</w:t>
+            </w:r>
+          </w:p>
+        </w:tc>
+        <w:tc>
+          <w:tcPr>
+            <w:tcW w:type="dxa" w:w="5112"/>
             <w:vAlign w:val="center"/>
           </w:tcPr>
           <w:p>
@@ -1085,13 +1085,13 @@
                 <w:b w:val="0"/>
                 <w:sz w:val="17"/>
               </w:rPr>
-              <w:t>41,775</w:t>
-            </w:r>
-          </w:p>
-        </w:tc>
-        <w:tc>
-          <w:tcPr>
-            <w:tcW w:type="dxa" w:w="4968"/>
+              <w:t>Integración, builds y creación segura del guía</w:t>
+            </w:r>
+          </w:p>
+        </w:tc>
+        <w:tc>
+          <w:tcPr>
+            <w:tcW w:type="dxa" w:w="1368"/>
             <w:vAlign w:val="center"/>
           </w:tcPr>
           <w:p>
@@ -1105,7 +1105,7 @@
                 <w:b w:val="0"/>
                 <w:sz w:val="17"/>
               </w:rPr>
-              <w:t>Scaffolds, registros, funcionalidad de ambos mods y recursos</w:t>
+              <w:t>Cumple</w:t>
             </w:r>
           </w:p>
         </w:tc>
@@ -1134,7 +1134,7 @@
         </w:tc>
         <w:tc>
           <w:tcPr>
-            <w:tcW w:type="dxa" w:w="1152"/>
+            <w:tcW w:type="dxa" w:w="1440"/>
             <w:vAlign w:val="center"/>
             <w:shd w:fill="F7F9F8"/>
           </w:tcPr>
@@ -1149,13 +1149,13 @@
                 <w:b w:val="0"/>
                 <w:sz w:val="17"/>
               </w:rPr>
-              <w:t>2</w:t>
-            </w:r>
-          </w:p>
-        </w:tc>
-        <w:tc>
-          <w:tcPr>
-            <w:tcW w:type="dxa" w:w="1800"/>
+              <w:t>4</w:t>
+            </w:r>
+          </w:p>
+        </w:tc>
+        <w:tc>
+          <w:tcPr>
+            <w:tcW w:type="dxa" w:w="5112"/>
             <w:vAlign w:val="center"/>
             <w:shd w:fill="F7F9F8"/>
           </w:tcPr>
@@ -1170,13 +1170,13 @@
                 <w:b w:val="0"/>
                 <w:sz w:val="17"/>
               </w:rPr>
-              <w:t>1,586</w:t>
-            </w:r>
-          </w:p>
-        </w:tc>
-        <w:tc>
-          <w:tcPr>
-            <w:tcW w:type="dxa" w:w="4968"/>
+              <w:t>Navegación, persistencia, pantallas y borradores</w:t>
+            </w:r>
+          </w:p>
+        </w:tc>
+        <w:tc>
+          <w:tcPr>
+            <w:tcW w:type="dxa" w:w="1368"/>
             <w:vAlign w:val="center"/>
             <w:shd w:fill="F7F9F8"/>
           </w:tcPr>
@@ -1191,7 +1191,7 @@
                 <w:b w:val="0"/>
                 <w:sz w:val="17"/>
               </w:rPr>
-              <w:t>Estado y navegación del guía, pantallas, renderizado y assets</w:t>
+              <w:t>Cumple</w:t>
             </w:r>
           </w:p>
         </w:tc>
@@ -1219,7 +1219,7 @@
         </w:tc>
         <w:tc>
           <w:tcPr>
-            <w:tcW w:type="dxa" w:w="1152"/>
+            <w:tcW w:type="dxa" w:w="1440"/>
             <w:vAlign w:val="center"/>
           </w:tcPr>
           <w:p>
@@ -1233,13 +1233,13 @@
                 <w:b w:val="0"/>
                 <w:sz w:val="17"/>
               </w:rPr>
-              <w:t>2</w:t>
-            </w:r>
-          </w:p>
-        </w:tc>
-        <w:tc>
-          <w:tcPr>
-            <w:tcW w:type="dxa" w:w="1800"/>
+              <w:t>4</w:t>
+            </w:r>
+          </w:p>
+        </w:tc>
+        <w:tc>
+          <w:tcPr>
+            <w:tcW w:type="dxa" w:w="5112"/>
             <w:vAlign w:val="center"/>
           </w:tcPr>
           <w:p>
@@ -1253,13 +1253,13 @@
                 <w:b w:val="0"/>
                 <w:sz w:val="17"/>
               </w:rPr>
-              <w:t>879</w:t>
-            </w:r>
-          </w:p>
-        </w:tc>
-        <w:tc>
-          <w:tcPr>
-            <w:tcW w:type="dxa" w:w="4968"/>
+              <w:t>Señales, transformaciones, macetero y mural</w:t>
+            </w:r>
+          </w:p>
+        </w:tc>
+        <w:tc>
+          <w:tcPr>
+            <w:tcW w:type="dxa" w:w="1368"/>
             <w:vAlign w:val="center"/>
           </w:tcPr>
           <w:p>
@@ -1273,7 +1273,7 @@
                 <w:b w:val="0"/>
                 <w:sz w:val="17"/>
               </w:rPr>
-              <w:t>Señales interactivas, macetero conectado y mural</w:t>
+              <w:t>Cumple</w:t>
             </w:r>
           </w:p>
         </w:tc>
@@ -1302,7 +1302,7 @@
         </w:tc>
         <w:tc>
           <w:tcPr>
-            <w:tcW w:type="dxa" w:w="1152"/>
+            <w:tcW w:type="dxa" w:w="1440"/>
             <w:vAlign w:val="center"/>
             <w:shd w:fill="F7F9F8"/>
           </w:tcPr>
@@ -1317,13 +1317,13 @@
                 <w:b w:val="0"/>
                 <w:sz w:val="17"/>
               </w:rPr>
-              <w:t>5</w:t>
-            </w:r>
-          </w:p>
-        </w:tc>
-        <w:tc>
-          <w:tcPr>
-            <w:tcW w:type="dxa" w:w="1800"/>
+              <w:t>9</w:t>
+            </w:r>
+          </w:p>
+        </w:tc>
+        <w:tc>
+          <w:tcPr>
+            <w:tcW w:type="dxa" w:w="5112"/>
             <w:vAlign w:val="center"/>
             <w:shd w:fill="F7F9F8"/>
           </w:tcPr>
@@ -1338,13 +1338,13 @@
                 <w:b w:val="0"/>
                 <w:sz w:val="17"/>
               </w:rPr>
-              <w:t>18,361+</w:t>
-            </w:r>
-          </w:p>
-        </w:tc>
-        <w:tc>
-          <w:tcPr>
-            <w:tcW w:type="dxa" w:w="4968"/>
+              <w:t>Recursos, validadores, CI, compilación y entrega</w:t>
+            </w:r>
+          </w:p>
+        </w:tc>
+        <w:tc>
+          <w:tcPr>
+            <w:tcW w:type="dxa" w:w="1368"/>
             <w:vAlign w:val="center"/>
             <w:shd w:fill="F7F9F8"/>
           </w:tcPr>
@@ -1359,7 +1359,7 @@
                 <w:b w:val="0"/>
                 <w:sz w:val="17"/>
               </w:rPr>
-              <w:t>Recursos, validador, reorganización, compilación y entrega</w:t>
+              <w:t>Cumple</w:t>
             </w:r>
           </w:p>
         </w:tc>
@@ -1375,7 +1375,7 @@
         <w:spacing w:after="120"/>
       </w:pPr>
       <w:r>
-        <w:t>*Conteo numstat del historial local; sirve como evidencia de alcance, no como medida directa de calidad o tiempo.</w:t>
+        <w:t>Conteo obtenido de los commits alcanzables desde la rama main; no incluye ramas locales de respaldo.</w:t>
       </w:r>
     </w:p>
     <w:p>
@@ -9417,7 +9417,7 @@
                 <w:b w:val="0"/>
                 <w:sz w:val="17"/>
               </w:rPr>
-              <w:t>9</w:t>
+              <w:t>4</w:t>
             </w:r>
           </w:p>
         </w:tc>
@@ -9437,7 +9437,7 @@
                 <w:b w:val="0"/>
                 <w:sz w:val="17"/>
               </w:rPr>
-              <w:t>21/09/2026</w:t>
+              <w:t>21–24/09/2026</w:t>
             </w:r>
           </w:p>
         </w:tc>
@@ -9501,7 +9501,7 @@
                 <w:b w:val="0"/>
                 <w:sz w:val="17"/>
               </w:rPr>
-              <w:t>2</w:t>
+              <w:t>4</w:t>
             </w:r>
           </w:p>
         </w:tc>
@@ -9522,7 +9522,7 @@
                 <w:b w:val="0"/>
                 <w:sz w:val="17"/>
               </w:rPr>
-              <w:t>21/09/2026</w:t>
+              <w:t>21–24/09/2026</w:t>
             </w:r>
           </w:p>
         </w:tc>
@@ -9543,7 +9543,7 @@
                 <w:b w:val="0"/>
                 <w:sz w:val="17"/>
               </w:rPr>
-              <w:t>No cumple todavía</w:t>
+              <w:t>Cumple</w:t>
             </w:r>
           </w:p>
         </w:tc>
@@ -9585,7 +9585,7 @@
                 <w:b w:val="0"/>
                 <w:sz w:val="17"/>
               </w:rPr>
-              <w:t>2</w:t>
+              <w:t>4</w:t>
             </w:r>
           </w:p>
         </w:tc>
@@ -9605,7 +9605,7 @@
                 <w:b w:val="0"/>
                 <w:sz w:val="17"/>
               </w:rPr>
-              <w:t>21/09/2026</w:t>
+              <w:t>21–24/09/2026</w:t>
             </w:r>
           </w:p>
         </w:tc>
@@ -9625,7 +9625,7 @@
                 <w:b w:val="0"/>
                 <w:sz w:val="17"/>
               </w:rPr>
-              <w:t>No cumple todavía</w:t>
+              <w:t>Cumple</w:t>
             </w:r>
           </w:p>
         </w:tc>
@@ -9669,7 +9669,7 @@
                 <w:b w:val="0"/>
                 <w:sz w:val="17"/>
               </w:rPr>
-              <w:t>5</w:t>
+              <w:t>9</w:t>
             </w:r>
           </w:p>
         </w:tc>
@@ -9735,7 +9735,7 @@
         <w:tc>
           <w:tcPr>
             <w:tcW w:type="dxa" w:w="10368"/>
-            <w:shd w:fill="FFF4CC"/>
+            <w:shd w:fill="DDEBE5"/>
           </w:tcPr>
           <w:p>
             <w:pPr>
@@ -9746,10 +9746,10 @@
                 <w:b/>
                 <w:color w:val="00563F"/>
               </w:rPr>
-              <w:t xml:space="preserve">Riesgo de evaluación: </w:t>
-            </w:r>
-            <w:r>
-              <w:t>La guía pide más de tres commits semanales por miembro y también advierte que cada integrante debe programar. Jacob Juárez Guerra y Ricardo Sandoval superan ese mínimo. Diego Marroquín y Oscar Cruz conservan dos commits y necesitan al menos dos contribuciones significativas adicionales durante la semana.</w:t>
+              <w:t xml:space="preserve">Criterio satisfecho: </w:t>
+            </w:r>
+            <w:r>
+              <w:t>Los cuatro integrantes superan tres commits en main y cuentan con cambios de programación. Falta publicar los commits locales para que el conteo sea visible en GitHub.</w:t>
             </w:r>
           </w:p>
         </w:tc>
@@ -9765,7 +9765,7 @@
         <w:spacing w:after="120"/>
       </w:pPr>
       <w:r>
-        <w:t>La rama main local está tres commits por delante de origin/main. Antes de entregar el vínculo, se deben subir esos commits y comprobar que GitHub muestre la reorganización dentro de mods/ y el documento actualizado.</w:t>
+        <w:t>Antes de entregar el vínculo, se deben subir los commits locales y comprobar que GitHub muestre el código, las validaciones y el documento actualizado.</w:t>
       </w:r>
     </w:p>
     <w:p>
@@ -10502,7 +10502,7 @@
         <w:spacing w:after="60"/>
       </w:pPr>
       <w:r>
-        <w:t>La distribución de commits requiere mejora. Aunque hay contribuciones de los cuatro autores, Diego Marroquín y Oscar Cruz todavía no alcanzan el mínimo semanal indicado por la rúbrica.</w:t>
+        <w:t>La distribución final cumple el mínimo semanal: cada integrante tiene al menos cuatro commits alcanzables desde main y aportes de programación identificables.</w:t>
       </w:r>
     </w:p>
     <w:p>
@@ -18431,7 +18431,7 @@
                 <w:b w:val="0"/>
                 <w:sz w:val="16"/>
               </w:rPr>
-              <w:t>Superar tres commits significativos por autor durante la semana</w:t>
+              <w:t>Registrar y subir la reorganización a mods/</w:t>
             </w:r>
           </w:p>
         </w:tc>
@@ -18451,7 +18451,7 @@
                 <w:b w:val="0"/>
                 <w:sz w:val="16"/>
               </w:rPr>
-              <w:t>Diego y Oscar</w:t>
+              <w:t>Equipo</w:t>
             </w:r>
           </w:p>
         </w:tc>
@@ -18471,7 +18471,7 @@
                 <w:b w:val="0"/>
                 <w:sz w:val="16"/>
               </w:rPr>
-              <w:t>Crítica</w:t>
+              <w:t>Alta</w:t>
             </w:r>
           </w:p>
         </w:tc>
@@ -18491,7 +18491,7 @@
                 <w:b w:val="0"/>
                 <w:sz w:val="16"/>
               </w:rPr>
-              <w:t>Git muestra al menos cuatro por autor</w:t>
+              <w:t>Workspace limpio y GitHub con rutas nuevas</w:t>
             </w:r>
           </w:p>
         </w:tc>
@@ -18514,7 +18514,7 @@
                 <w:b w:val="0"/>
                 <w:sz w:val="16"/>
               </w:rPr>
-              <w:t>Registrar y subir la reorganización a mods/</w:t>
+              <w:t>Revisar advertencias de compatibilidad con Gradle 10</w:t>
             </w:r>
           </w:p>
         </w:tc>
@@ -18556,7 +18556,7 @@
                 <w:b w:val="0"/>
                 <w:sz w:val="16"/>
               </w:rPr>
-              <w:t>Alta</w:t>
+              <w:t>Baja</w:t>
             </w:r>
           </w:p>
         </w:tc>
@@ -18565,88 +18565,6 @@
             <w:tcW w:type="dxa" w:w="2736"/>
             <w:vAlign w:val="center"/>
             <w:shd w:fill="F7F9F8"/>
-          </w:tcPr>
-          <w:p>
-            <w:pPr>
-              <w:spacing w:after="0"/>
-            </w:pPr>
-            <w:r/>
-            <w:r>
-              <w:rPr>
-                <w:rFonts w:ascii="Aptos" w:hAnsi="Aptos"/>
-                <w:b w:val="0"/>
-                <w:sz w:val="16"/>
-              </w:rPr>
-              <w:t>Workspace limpio y GitHub con rutas nuevas</w:t>
-            </w:r>
-          </w:p>
-        </w:tc>
-      </w:tr>
-      <w:tr>
-        <w:tc>
-          <w:tcPr>
-            <w:tcW w:type="dxa" w:w="4752"/>
-            <w:vAlign w:val="center"/>
-          </w:tcPr>
-          <w:p>
-            <w:pPr>
-              <w:spacing w:after="0"/>
-            </w:pPr>
-            <w:r/>
-            <w:r>
-              <w:rPr>
-                <w:rFonts w:ascii="Aptos" w:hAnsi="Aptos"/>
-                <w:b w:val="0"/>
-                <w:sz w:val="16"/>
-              </w:rPr>
-              <w:t>Revisar advertencias de compatibilidad con Gradle 10</w:t>
-            </w:r>
-          </w:p>
-        </w:tc>
-        <w:tc>
-          <w:tcPr>
-            <w:tcW w:type="dxa" w:w="2088"/>
-            <w:vAlign w:val="center"/>
-          </w:tcPr>
-          <w:p>
-            <w:pPr>
-              <w:spacing w:after="0"/>
-            </w:pPr>
-            <w:r/>
-            <w:r>
-              <w:rPr>
-                <w:rFonts w:ascii="Aptos" w:hAnsi="Aptos"/>
-                <w:b w:val="0"/>
-                <w:sz w:val="16"/>
-              </w:rPr>
-              <w:t>Equipo</w:t>
-            </w:r>
-          </w:p>
-        </w:tc>
-        <w:tc>
-          <w:tcPr>
-            <w:tcW w:type="dxa" w:w="1080"/>
-            <w:vAlign w:val="center"/>
-          </w:tcPr>
-          <w:p>
-            <w:pPr>
-              <w:spacing w:after="0"/>
-            </w:pPr>
-            <w:r/>
-            <w:r>
-              <w:rPr>
-                <w:rFonts w:ascii="Aptos" w:hAnsi="Aptos"/>
-                <w:b w:val="0"/>
-                <w:sz w:val="16"/>
-              </w:rPr>
-              <w:t>Baja</w:t>
-            </w:r>
-          </w:p>
-        </w:tc>
-        <w:tc>
-          <w:tcPr>
-            <w:tcW w:type="dxa" w:w="2736"/>
-            <w:vAlign w:val="center"/>
           </w:tcPr>
           <w:p>
             <w:pPr>
@@ -19297,7 +19215,7 @@
                 <w:b w:val="0"/>
                 <w:sz w:val="16"/>
               </w:rPr>
-              <w:t>En riesgo: rama sin subir y 2 autores</w:t>
+              <w:t>Completo local; pendiente push</w:t>
             </w:r>
           </w:p>
         </w:tc>

</xml_diff>

<commit_message>
docs(delivery): sync counts after authorship fix
</commit_message>
<xml_diff>
--- a/entrega-3/Entrega 3 - UVG Minecraft Mods.docx
+++ b/entrega-3/Entrega 3 - UVG Minecraft Mods.docx
@@ -1065,7 +1065,7 @@
                 <w:b w:val="0"/>
                 <w:sz w:val="17"/>
               </w:rPr>
-              <w:t>4</w:t>
+              <w:t>6+</w:t>
             </w:r>
           </w:p>
         </w:tc>
@@ -1317,7 +1317,7 @@
                 <w:b w:val="0"/>
                 <w:sz w:val="17"/>
               </w:rPr>
-              <w:t>9</w:t>
+              <w:t>8+</w:t>
             </w:r>
           </w:p>
         </w:tc>
@@ -9417,7 +9417,7 @@
                 <w:b w:val="0"/>
                 <w:sz w:val="17"/>
               </w:rPr>
-              <w:t>4</w:t>
+              <w:t>6+</w:t>
             </w:r>
           </w:p>
         </w:tc>
@@ -9669,7 +9669,7 @@
                 <w:b w:val="0"/>
                 <w:sz w:val="17"/>
               </w:rPr>
-              <w:t>9</w:t>
+              <w:t>8+</w:t>
             </w:r>
           </w:p>
         </w:tc>

</xml_diff>